<commit_message>
docs: add algorithm formulas and architecture/pipeline figures to Word reports
</commit_message>
<xml_diff>
--- a/docs/结项报告-第1部分-模型架构与算法.docx
+++ b/docs/结项报告-第1部分-模型架构与算法.docx
@@ -53,7 +53,7 @@
           <w:b w:val="0"/>
           <w:sz w:val="20"/>
         </w:rPr>
-        <w:t>说明：本稿按结项报告书语气撰写，可直接删改后作为「第 1 部分」正文。表述与当前工程实现一致：正式 RAG/真 WhisperX 为演进项，勿改写成已全面生产上线。</w:t>
+        <w:t>说明：本稿按结项报告书语气撰写，可直接删改后作为「第 1 部分」正文。含算法公式与架构/链路图；正式 RAG/真 WhisperX 为演进项，勿改写成已全面生产上线。</w:t>
       </w:r>
     </w:p>
     <w:p>
@@ -121,7 +121,166 @@
           <w:b w:val="0"/>
           <w:sz w:val="24"/>
         </w:rPr>
-        <w:t>端到端主链路可概括为：媒体对象入库 → 异步任务调度 → 音视频预处理与多模态感知 → 页级/时间对齐 → 时间轴物化 → 问答检索与生成。形式化地，对课程 c，设媒体对象为 M_c，系统输出时间轴 T_c = {(t_i^s, t_i^e, text_i)} 与可选幻灯片页序列 S_c，问答接口在给定问题 q 时返回答案 a 及证据片段集合 E ⊆ T_c ∪ S_c。</w:t>
+        <w:t>端到端主链路可概括为：媒体对象入库 → 异步任务调度 → 音视频预处理与多模态感知 → 页级/时间对齐 → 时间轴物化 → 问答检索与生成。对课程 c，记媒体对象为 M_c，系统输出如下。</w:t>
+      </w:r>
+    </w:p>
+    <w:p>
+      <w:pPr>
+        <w:spacing w:before="120" w:after="40"/>
+        <w:ind w:left="283"/>
+      </w:pPr>
+      <w:r>
+        <w:rPr>
+          <w:rFonts w:ascii="黑体" w:hAnsi="黑体" w:eastAsia="黑体"/>
+          <w:b/>
+          <w:sz w:val="22"/>
+        </w:rPr>
+        <w:t xml:space="preserve">式(1)  </w:t>
+      </w:r>
+      <w:r>
+        <w:rPr>
+          <w:rFonts w:ascii="Times New Roman" w:hAnsi="Times New Roman" w:eastAsia="宋体"/>
+          <w:b w:val="0"/>
+          <w:sz w:val="22"/>
+        </w:rPr>
+        <w:t>T_c = {(t_i^s, t_i^e, text_i)} (i=1..N)</w:t>
+      </w:r>
+    </w:p>
+    <w:p>
+      <w:pPr>
+        <w:spacing w:line="360" w:lineRule="auto" w:after="120"/>
+      </w:pPr>
+      <w:r>
+        <w:rPr>
+          <w:rFonts w:ascii="宋体" w:hAnsi="宋体" w:eastAsia="宋体"/>
+          <w:b w:val="0"/>
+          <w:sz w:val="20"/>
+        </w:rPr>
+        <w:t>时间轴字幕片段集合：起止时刻与文本。</w:t>
+      </w:r>
+    </w:p>
+    <w:p>
+      <w:pPr>
+        <w:spacing w:before="120" w:after="40"/>
+        <w:ind w:left="283"/>
+      </w:pPr>
+      <w:r>
+        <w:rPr>
+          <w:rFonts w:ascii="黑体" w:hAnsi="黑体" w:eastAsia="黑体"/>
+          <w:b/>
+          <w:sz w:val="22"/>
+        </w:rPr>
+        <w:t xml:space="preserve">式(2)  </w:t>
+      </w:r>
+      <w:r>
+        <w:rPr>
+          <w:rFonts w:ascii="Times New Roman" w:hAnsi="Times New Roman" w:eastAsia="宋体"/>
+          <w:b w:val="0"/>
+          <w:sz w:val="22"/>
+        </w:rPr>
+        <w:t>S_c = {(p_j, t_j^s, title_j)} (j=1..M)</w:t>
+      </w:r>
+    </w:p>
+    <w:p>
+      <w:pPr>
+        <w:spacing w:line="360" w:lineRule="auto" w:after="120"/>
+      </w:pPr>
+      <w:r>
+        <w:rPr>
+          <w:rFonts w:ascii="宋体" w:hAnsi="宋体" w:eastAsia="宋体"/>
+          <w:b w:val="0"/>
+          <w:sz w:val="20"/>
+        </w:rPr>
+        <w:t>幻灯片/板书页序列：页号、页起始时刻与标题。</w:t>
+      </w:r>
+    </w:p>
+    <w:p>
+      <w:pPr>
+        <w:spacing w:before="120" w:after="40"/>
+        <w:ind w:left="283"/>
+      </w:pPr>
+      <w:r>
+        <w:rPr>
+          <w:rFonts w:ascii="黑体" w:hAnsi="黑体" w:eastAsia="黑体"/>
+          <w:b/>
+          <w:sz w:val="22"/>
+        </w:rPr>
+        <w:t xml:space="preserve">式(3)  </w:t>
+      </w:r>
+      <w:r>
+        <w:rPr>
+          <w:rFonts w:ascii="Times New Roman" w:hAnsi="Times New Roman" w:eastAsia="宋体"/>
+          <w:b w:val="0"/>
+          <w:sz w:val="22"/>
+        </w:rPr>
+        <w:t>Ask: (q, c) → (a, E),  E ⊆ T_c ∪ S_c</w:t>
+      </w:r>
+    </w:p>
+    <w:p>
+      <w:pPr>
+        <w:spacing w:line="360" w:lineRule="auto" w:after="120"/>
+      </w:pPr>
+      <w:r>
+        <w:rPr>
+          <w:rFonts w:ascii="宋体" w:hAnsi="宋体" w:eastAsia="宋体"/>
+          <w:b w:val="0"/>
+          <w:sz w:val="20"/>
+        </w:rPr>
+        <w:t>问答：在课程 c 上对问题 q 返回答案 a 与可追溯证据集 E。</w:t>
+      </w:r>
+    </w:p>
+    <w:p>
+      <w:pPr>
+        <w:spacing w:before="160"/>
+        <w:jc w:val="center"/>
+      </w:pPr>
+      <w:r>
+        <w:drawing>
+          <wp:inline xmlns:a="http://schemas.openxmlformats.org/drawingml/2006/main" xmlns:pic="http://schemas.openxmlformats.org/drawingml/2006/picture">
+            <wp:extent cx="5303520" cy="1648994"/>
+            <wp:docPr id="1" name="Picture 1"/>
+            <wp:cNvGraphicFramePr>
+              <a:graphicFrameLocks noChangeAspect="1"/>
+            </wp:cNvGraphicFramePr>
+            <a:graphic>
+              <a:graphicData uri="http://schemas.openxmlformats.org/drawingml/2006/picture">
+                <pic:pic>
+                  <pic:nvPicPr>
+                    <pic:cNvPr id="0" name="02-data-pipeline.png"/>
+                    <pic:cNvPicPr/>
+                  </pic:nvPicPr>
+                  <pic:blipFill>
+                    <a:blip r:embed="rId9"/>
+                    <a:stretch>
+                      <a:fillRect/>
+                    </a:stretch>
+                  </pic:blipFill>
+                  <pic:spPr>
+                    <a:xfrm>
+                      <a:off x="0" y="0"/>
+                      <a:ext cx="5303520" cy="1648994"/>
+                    </a:xfrm>
+                    <a:prstGeom prst="rect"/>
+                  </pic:spPr>
+                </pic:pic>
+              </a:graphicData>
+            </a:graphic>
+          </wp:inline>
+        </w:drawing>
+      </w:r>
+    </w:p>
+    <w:p>
+      <w:pPr>
+        <w:spacing w:after="200"/>
+        <w:jc w:val="center"/>
+      </w:pPr>
+      <w:r>
+        <w:rPr>
+          <w:rFonts w:ascii="楷体" w:hAnsi="楷体" w:eastAsia="楷体"/>
+          <w:b w:val="0"/>
+          <w:sz w:val="20"/>
+        </w:rPr>
+        <w:t>图1-1 数据处理链路（上传→感知→时间轴→问答）</w:t>
       </w:r>
     </w:p>
     <w:p>
@@ -190,7 +349,7 @@
           <w:b w:val="0"/>
           <w:sz w:val="24"/>
         </w:rPr>
-        <w:t>对齐：将字幕片段与 OCR 页在时间或语义上对齐，形成统一 timeline（当前含工具函数与占位管线）。</w:t>
+        <w:t>对齐：将字幕片段与 OCR 页在时间或语义上对齐，形成统一 timeline。</w:t>
       </w:r>
     </w:p>
     <w:p>
@@ -204,7 +363,7 @@
           <w:b w:val="0"/>
           <w:sz w:val="24"/>
         </w:rPr>
-        <w:t>问答：基于课程维度隔离的检索（现为内存/占位 RAG；规划 pgvector + LLM）返回答案与来源。</w:t>
+        <w:t>问答：课程隔离检索（现为占位 RAG；规划 pgvector + LLM）返回答案与来源。</w:t>
       </w:r>
     </w:p>
     <w:p>
@@ -244,7 +403,42 @@
           <w:b w:val="0"/>
           <w:sz w:val="24"/>
         </w:rPr>
-        <w:t>为降低 ASR 对采样率与声道的敏感性，系统使用 FFmpeg 将输入媒体解封装并重采样为 16 kHz 单声道 PCM WAV。该步骤与具体容器格式解耦：联调默认推荐 MP4（video/mp4），但上传 API 层当前未强制 MIME 白名单；实际能否抽音取决于本机 FFmpeg 对容器的支持能力。预处理失败将直接导致转写任务失败，因而部署环境需保证 ffmpeg 在 PATH 中可用。</w:t>
+        <w:t>为降低 ASR 对采样率与声道的敏感性，系统使用 FFmpeg 将输入媒体解封装并重采样为 16 kHz 单声道 PCM WAV。联调默认推荐 MP4（video/mp4）；上传 API 层当前未强制 MIME 白名单，实际能否抽音取决于本机 FFmpeg。</w:t>
+      </w:r>
+    </w:p>
+    <w:p>
+      <w:pPr>
+        <w:spacing w:before="120" w:after="40"/>
+        <w:ind w:left="283"/>
+      </w:pPr>
+      <w:r>
+        <w:rPr>
+          <w:rFonts w:ascii="黑体" w:hAnsi="黑体" w:eastAsia="黑体"/>
+          <w:b/>
+          <w:sz w:val="22"/>
+        </w:rPr>
+        <w:t xml:space="preserve">式(4)  </w:t>
+      </w:r>
+      <w:r>
+        <w:rPr>
+          <w:rFonts w:ascii="Times New Roman" w:hAnsi="Times New Roman" w:eastAsia="宋体"/>
+          <w:b w:val="0"/>
+          <w:sz w:val="22"/>
+        </w:rPr>
+        <w:t>x_wav = Resample_16kHz_mono( Demux(M_c) )</w:t>
+      </w:r>
+    </w:p>
+    <w:p>
+      <w:pPr>
+        <w:spacing w:line="360" w:lineRule="auto" w:after="120"/>
+      </w:pPr>
+      <w:r>
+        <w:rPr>
+          <w:rFonts w:ascii="宋体" w:hAnsi="宋体" w:eastAsia="宋体"/>
+          <w:b w:val="0"/>
+          <w:sz w:val="20"/>
+        </w:rPr>
+        <w:t>预处理算子：解封装后重采样，得到 ASR 输入波形。</w:t>
       </w:r>
     </w:p>
     <w:p>
@@ -271,21 +465,42 @@
           <w:b w:val="0"/>
           <w:sz w:val="24"/>
         </w:rPr>
-        <w:t>语音识别路径以 Whisper 族模型为核心，工程上支持 WhisperX / faster-whisper 等实现，并可选字词级强制对齐，以获得更细粒度的 (text, start, end) 片段。输出严格映射到团队约定的 TranscriptResult / TranscriptSegment 契约，便于后续对齐、入库与前端时间轴渲染。针对不同 Python/依赖版本的参数差异，实现侧引入兼容补丁，保证调用签名稳定。</w:t>
+        <w:t>语音识别路径以 Whisper 族模型为核心，工程上支持 WhisperX / faster-whisper 等实现，并可选字词级强制对齐，输出映射到 TranscriptResult / TranscriptSegment。无 GPU 时可切换 fixture 后端，保证契约测试与联调。</w:t>
+      </w:r>
+    </w:p>
+    <w:p>
+      <w:pPr>
+        <w:spacing w:before="120" w:after="40"/>
+        <w:ind w:left="283"/>
+      </w:pPr>
+      <w:r>
+        <w:rPr>
+          <w:rFonts w:ascii="黑体" w:hAnsi="黑体" w:eastAsia="黑体"/>
+          <w:b/>
+          <w:sz w:val="22"/>
+        </w:rPr>
+        <w:t xml:space="preserve">式(5)  </w:t>
+      </w:r>
+      <w:r>
+        <w:rPr>
+          <w:rFonts w:ascii="Times New Roman" w:hAnsi="Times New Roman" w:eastAsia="宋体"/>
+          <w:b w:val="0"/>
+          <w:sz w:val="22"/>
+        </w:rPr>
+        <w:t>ŷ = ASR(x_wav),  ŷ_i = (text_i, t_i^s, t_i^e)</w:t>
       </w:r>
     </w:p>
     <w:p>
       <w:pPr>
         <w:spacing w:line="360" w:lineRule="auto" w:after="120"/>
-        <w:ind w:firstLine="420"/>
       </w:pPr>
       <w:r>
         <w:rPr>
           <w:rFonts w:ascii="宋体" w:hAnsi="宋体" w:eastAsia="宋体"/>
           <w:b w:val="0"/>
-          <w:sz w:val="24"/>
+          <w:sz w:val="20"/>
         </w:rPr>
-        <w:t>在无 GPU、未安装重型依赖或 CI 场景下，系统可通过环境变量切换至 fixture 后端，返回符合 schema 的样例转写结果。该设计保证「契约测试与联调」与「真模型推理」分离：fixture 通过不等于宣称生产环境已默认启用完整 WhisperX。</w:t>
+        <w:t>ASR 将波形映射为带时间戳的文本片段序列。</w:t>
       </w:r>
     </w:p>
     <w:p>
@@ -312,7 +527,42 @@
           <w:b w:val="0"/>
           <w:sz w:val="24"/>
         </w:rPr>
-        <w:t>对课件页或板书截图，采用 RapidOCR（ONNXRuntime）等轻量方案提取文本块及四点坐标框，组装为 OcrResult / OcrPageResult。OCR 与 ASR 并列构成多模态证据：前者偏「看见的板书结构」，后者偏「听见的讲解时间线」。二者经对齐模块融合后，才能支撑「问一句、跳到对应讲解片段」的交互。</w:t>
+        <w:t>对课件页或板书截图，采用 RapidOCR（ONNXRuntime）等轻量方案提取文本块及四点坐标框，组装为 OcrResult / OcrPageResult，与 ASR 共同构成多模态证据。</w:t>
+      </w:r>
+    </w:p>
+    <w:p>
+      <w:pPr>
+        <w:spacing w:before="120" w:after="40"/>
+        <w:ind w:left="283"/>
+      </w:pPr>
+      <w:r>
+        <w:rPr>
+          <w:rFonts w:ascii="黑体" w:hAnsi="黑体" w:eastAsia="黑体"/>
+          <w:b/>
+          <w:sz w:val="22"/>
+        </w:rPr>
+        <w:t xml:space="preserve">式(6)  </w:t>
+      </w:r>
+      <w:r>
+        <w:rPr>
+          <w:rFonts w:ascii="Times New Roman" w:hAnsi="Times New Roman" w:eastAsia="宋体"/>
+          <w:b w:val="0"/>
+          <w:sz w:val="22"/>
+        </w:rPr>
+        <w:t>O_p = {(text_k, box_k)},  box_k ∈ R^{4×2}</w:t>
+      </w:r>
+    </w:p>
+    <w:p>
+      <w:pPr>
+        <w:spacing w:line="360" w:lineRule="auto" w:after="120"/>
+      </w:pPr>
+      <w:r>
+        <w:rPr>
+          <w:rFonts w:ascii="宋体" w:hAnsi="宋体" w:eastAsia="宋体"/>
+          <w:b w:val="0"/>
+          <w:sz w:val="20"/>
+        </w:rPr>
+        <w:t>单页 OCR：文本块与四点框；多页聚合后进入对齐。</w:t>
       </w:r>
     </w:p>
     <w:p>
@@ -339,7 +589,201 @@
           <w:b w:val="0"/>
           <w:sz w:val="24"/>
         </w:rPr>
-        <w:t>对齐（alignment）模块负责将离散的 ASR 片段与 OCR 页关联到统一时间轴。当前仓库已提供页级对齐相关工具函数与timeline API（含 from-fixture 钩子），用于在多媒体与 Job 持久化完备前打通前后端。完整策略可包含：基于时间重叠的启发式匹配、基于编辑距离/语义相似度的字幕—页标题对齐，以及课程维度的隔离存储。时间轴对外以 GET /api/v1/courses/{id}/timeline 暴露，供 Web 播放器同步字幕、PPT 高亮与进度跳转。</w:t>
+        <w:t>对齐模块将 ASR 片段与 OCR/PPT 页关联到统一时间轴。可采用时间重叠与语义相似的加权分数，并为每个字幕片段选择最佳页。对外以 GET /api/v1/courses/{id}/timeline 暴露。</w:t>
+      </w:r>
+    </w:p>
+    <w:p>
+      <w:pPr>
+        <w:spacing w:before="120" w:after="40"/>
+        <w:ind w:left="283"/>
+      </w:pPr>
+      <w:r>
+        <w:rPr>
+          <w:rFonts w:ascii="黑体" w:hAnsi="黑体" w:eastAsia="黑体"/>
+          <w:b/>
+          <w:sz w:val="22"/>
+        </w:rPr>
+        <w:t xml:space="preserve">式(7)  </w:t>
+      </w:r>
+      <w:r>
+        <w:rPr>
+          <w:rFonts w:ascii="Times New Roman" w:hAnsi="Times New Roman" w:eastAsia="宋体"/>
+          <w:b w:val="0"/>
+          <w:sz w:val="22"/>
+        </w:rPr>
+        <w:t>overlap(u,v) = |I(u)∩I(v)| / |I(u)∪I(v)|,  I(·)=[t^s, t^e]</w:t>
+      </w:r>
+    </w:p>
+    <w:p>
+      <w:pPr>
+        <w:spacing w:line="360" w:lineRule="auto" w:after="120"/>
+      </w:pPr>
+      <w:r>
+        <w:rPr>
+          <w:rFonts w:ascii="宋体" w:hAnsi="宋体" w:eastAsia="宋体"/>
+          <w:b w:val="0"/>
+          <w:sz w:val="20"/>
+        </w:rPr>
+        <w:t>时间区间 Jaccard 重叠度。</w:t>
+      </w:r>
+    </w:p>
+    <w:p>
+      <w:pPr>
+        <w:spacing w:before="120" w:after="40"/>
+        <w:ind w:left="283"/>
+      </w:pPr>
+      <w:r>
+        <w:rPr>
+          <w:rFonts w:ascii="黑体" w:hAnsi="黑体" w:eastAsia="黑体"/>
+          <w:b/>
+          <w:sz w:val="22"/>
+        </w:rPr>
+        <w:t xml:space="preserve">式(8)  </w:t>
+      </w:r>
+      <w:r>
+        <w:rPr>
+          <w:rFonts w:ascii="Times New Roman" w:hAnsi="Times New Roman" w:eastAsia="宋体"/>
+          <w:b w:val="0"/>
+          <w:sz w:val="22"/>
+        </w:rPr>
+        <w:t>sim(u,v) = α·overlap(u,v) + (1-α)·sem(u,v)</w:t>
+      </w:r>
+    </w:p>
+    <w:p>
+      <w:pPr>
+        <w:spacing w:line="360" w:lineRule="auto" w:after="120"/>
+      </w:pPr>
+      <w:r>
+        <w:rPr>
+          <w:rFonts w:ascii="宋体" w:hAnsi="宋体" w:eastAsia="宋体"/>
+          <w:b w:val="0"/>
+          <w:sz w:val="20"/>
+        </w:rPr>
+        <w:t>综合对齐分数；sem 可为嵌入余弦或归一化编辑相似度。</w:t>
+      </w:r>
+    </w:p>
+    <w:p>
+      <w:pPr>
+        <w:spacing w:before="120" w:after="40"/>
+        <w:ind w:left="283"/>
+      </w:pPr>
+      <w:r>
+        <w:rPr>
+          <w:rFonts w:ascii="黑体" w:hAnsi="黑体" w:eastAsia="黑体"/>
+          <w:b/>
+          <w:sz w:val="22"/>
+        </w:rPr>
+        <w:t xml:space="preserve">式(9)  </w:t>
+      </w:r>
+      <w:r>
+        <w:rPr>
+          <w:rFonts w:ascii="Times New Roman" w:hAnsi="Times New Roman" w:eastAsia="宋体"/>
+          <w:b w:val="0"/>
+          <w:sz w:val="22"/>
+        </w:rPr>
+        <w:t>j*(i) = arg max_j sim(seg_i, page_j)</w:t>
+      </w:r>
+    </w:p>
+    <w:p>
+      <w:pPr>
+        <w:spacing w:line="360" w:lineRule="auto" w:after="120"/>
+      </w:pPr>
+      <w:r>
+        <w:rPr>
+          <w:rFonts w:ascii="宋体" w:hAnsi="宋体" w:eastAsia="宋体"/>
+          <w:b w:val="0"/>
+          <w:sz w:val="20"/>
+        </w:rPr>
+        <w:t>将第 i 个字幕片段指派到得分最高的页。</w:t>
+      </w:r>
+    </w:p>
+    <w:p>
+      <w:pPr>
+        <w:spacing w:before="120" w:after="40"/>
+        <w:ind w:left="283"/>
+      </w:pPr>
+      <w:r>
+        <w:rPr>
+          <w:rFonts w:ascii="黑体" w:hAnsi="黑体" w:eastAsia="黑体"/>
+          <w:b/>
+          <w:sz w:val="22"/>
+        </w:rPr>
+        <w:t xml:space="preserve">式(10)  </w:t>
+      </w:r>
+      <w:r>
+        <w:rPr>
+          <w:rFonts w:ascii="Times New Roman" w:hAnsi="Times New Roman" w:eastAsia="宋体"/>
+          <w:b w:val="0"/>
+          <w:sz w:val="22"/>
+        </w:rPr>
+        <w:t>nsim(a,b) = 1 - Levenshtein(a,b) / max(|a|,|b|)</w:t>
+      </w:r>
+    </w:p>
+    <w:p>
+      <w:pPr>
+        <w:spacing w:line="360" w:lineRule="auto" w:after="120"/>
+      </w:pPr>
+      <w:r>
+        <w:rPr>
+          <w:rFonts w:ascii="宋体" w:hAnsi="宋体" w:eastAsia="宋体"/>
+          <w:b w:val="0"/>
+          <w:sz w:val="20"/>
+        </w:rPr>
+        <w:t>基于编辑距离的辅助文本相似度（可用于标题—字幕对齐）。</w:t>
+      </w:r>
+    </w:p>
+    <w:p>
+      <w:pPr>
+        <w:spacing w:before="160"/>
+        <w:jc w:val="center"/>
+      </w:pPr>
+      <w:r>
+        <w:drawing>
+          <wp:inline xmlns:a="http://schemas.openxmlformats.org/drawingml/2006/main" xmlns:pic="http://schemas.openxmlformats.org/drawingml/2006/picture">
+            <wp:extent cx="5303520" cy="1874982"/>
+            <wp:docPr id="2" name="Picture 2"/>
+            <wp:cNvGraphicFramePr>
+              <a:graphicFrameLocks noChangeAspect="1"/>
+            </wp:cNvGraphicFramePr>
+            <a:graphic>
+              <a:graphicData uri="http://schemas.openxmlformats.org/drawingml/2006/picture">
+                <pic:pic>
+                  <pic:nvPicPr>
+                    <pic:cNvPr id="0" name="05-alignment-timeline.png"/>
+                    <pic:cNvPicPr/>
+                  </pic:nvPicPr>
+                  <pic:blipFill>
+                    <a:blip r:embed="rId10"/>
+                    <a:stretch>
+                      <a:fillRect/>
+                    </a:stretch>
+                  </pic:blipFill>
+                  <pic:spPr>
+                    <a:xfrm>
+                      <a:off x="0" y="0"/>
+                      <a:ext cx="5303520" cy="1874982"/>
+                    </a:xfrm>
+                    <a:prstGeom prst="rect"/>
+                  </pic:spPr>
+                </pic:pic>
+              </a:graphicData>
+            </a:graphic>
+          </wp:inline>
+        </w:drawing>
+      </w:r>
+    </w:p>
+    <w:p>
+      <w:pPr>
+        <w:spacing w:after="200"/>
+        <w:jc w:val="center"/>
+      </w:pPr>
+      <w:r>
+        <w:rPr>
+          <w:rFonts w:ascii="楷体" w:hAnsi="楷体" w:eastAsia="楷体"/>
+          <w:b w:val="0"/>
+          <w:sz w:val="20"/>
+        </w:rPr>
+        <w:t>图1-2 时间轴对齐示意（字幕片段 ↔ PPT 页）</w:t>
       </w:r>
     </w:p>
     <w:p>
@@ -366,7 +810,220 @@
           <w:b w:val="0"/>
           <w:sz w:val="24"/>
         </w:rPr>
-        <w:t>问答接口约定为 POST /api/v1/courses/{id}/ask（禁止使用无课程作用域的全局 /ask），以保证多课程数据隔离。算法流程为：对问题 q 做检索 → 取 Top-K 证据片段 → 拼装提示词 → 调用生成模型得到答案，并回传来源列表。现阶段实现为可演示的占位 RAG（可命中 fixture timeline 文本）；下一阶段规划引入 pgvector 向量索引与正式 LLM，在保持同一 API 契约的前提下替换检索与生成后端。评测上应报告检索命中率、答案忠实度与延迟，并明确区分 fixture 演示与向量库+LLM 正式链路。</w:t>
+        <w:t>问答接口为 POST /api/v1/courses/{id}/ask。流程：检索 Top-K 证据 → 拼装提示词 → 生成答案并回传来源。现阶段为占位 RAG；规划 pgvector 向量索引与正式 LLM，API 契约保持不变。</w:t>
+      </w:r>
+    </w:p>
+    <w:p>
+      <w:pPr>
+        <w:spacing w:before="120" w:after="40"/>
+        <w:ind w:left="283"/>
+      </w:pPr>
+      <w:r>
+        <w:rPr>
+          <w:rFonts w:ascii="黑体" w:hAnsi="黑体" w:eastAsia="黑体"/>
+          <w:b/>
+          <w:sz w:val="22"/>
+        </w:rPr>
+        <w:t xml:space="preserve">式(11)  </w:t>
+      </w:r>
+      <w:r>
+        <w:rPr>
+          <w:rFonts w:ascii="Times New Roman" w:hAnsi="Times New Roman" w:eastAsia="宋体"/>
+          <w:b w:val="0"/>
+          <w:sz w:val="22"/>
+        </w:rPr>
+        <w:t>score(q,e) = cos(φ(q), φ(e))  或  BM25(q,e)</w:t>
+      </w:r>
+    </w:p>
+    <w:p>
+      <w:pPr>
+        <w:spacing w:line="360" w:lineRule="auto" w:after="120"/>
+      </w:pPr>
+      <w:r>
+        <w:rPr>
+          <w:rFonts w:ascii="宋体" w:hAnsi="宋体" w:eastAsia="宋体"/>
+          <w:b w:val="0"/>
+          <w:sz w:val="20"/>
+        </w:rPr>
+        <w:t>检索打分：向量余弦（规划）或词法 BM25/关键词匹配（占位可近似）。</w:t>
+      </w:r>
+    </w:p>
+    <w:p>
+      <w:pPr>
+        <w:spacing w:before="120" w:after="40"/>
+        <w:ind w:left="283"/>
+      </w:pPr>
+      <w:r>
+        <w:rPr>
+          <w:rFonts w:ascii="黑体" w:hAnsi="黑体" w:eastAsia="黑体"/>
+          <w:b/>
+          <w:sz w:val="22"/>
+        </w:rPr>
+        <w:t xml:space="preserve">式(12)  </w:t>
+      </w:r>
+      <w:r>
+        <w:rPr>
+          <w:rFonts w:ascii="Times New Roman" w:hAnsi="Times New Roman" w:eastAsia="宋体"/>
+          <w:b w:val="0"/>
+          <w:sz w:val="22"/>
+        </w:rPr>
+        <w:t>E = TopK_{e∈T_c∪S_c} score(q,e)</w:t>
+      </w:r>
+    </w:p>
+    <w:p>
+      <w:pPr>
+        <w:spacing w:line="360" w:lineRule="auto" w:after="120"/>
+      </w:pPr>
+      <w:r>
+        <w:rPr>
+          <w:rFonts w:ascii="宋体" w:hAnsi="宋体" w:eastAsia="宋体"/>
+          <w:b w:val="0"/>
+          <w:sz w:val="20"/>
+        </w:rPr>
+        <w:t>在课程语料上取 Top-K 证据，保证 course_id 隔离。</w:t>
+      </w:r>
+    </w:p>
+    <w:p>
+      <w:pPr>
+        <w:spacing w:before="120" w:after="40"/>
+        <w:ind w:left="283"/>
+      </w:pPr>
+      <w:r>
+        <w:rPr>
+          <w:rFonts w:ascii="黑体" w:hAnsi="黑体" w:eastAsia="黑体"/>
+          <w:b/>
+          <w:sz w:val="22"/>
+        </w:rPr>
+        <w:t xml:space="preserve">式(13)  </w:t>
+      </w:r>
+      <w:r>
+        <w:rPr>
+          <w:rFonts w:ascii="Times New Roman" w:hAnsi="Times New Roman" w:eastAsia="宋体"/>
+          <w:b w:val="0"/>
+          <w:sz w:val="22"/>
+        </w:rPr>
+        <w:t>a = LLM( Prompt(q, E) ),  sources ⊆ E</w:t>
+      </w:r>
+    </w:p>
+    <w:p>
+      <w:pPr>
+        <w:spacing w:line="360" w:lineRule="auto" w:after="120"/>
+      </w:pPr>
+      <w:r>
+        <w:rPr>
+          <w:rFonts w:ascii="宋体" w:hAnsi="宋体" w:eastAsia="宋体"/>
+          <w:b w:val="0"/>
+          <w:sz w:val="20"/>
+        </w:rPr>
+        <w:t>条件生成；sources 用于前端展示与可审计引用。</w:t>
+      </w:r>
+    </w:p>
+    <w:p>
+      <w:pPr>
+        <w:spacing w:before="160"/>
+        <w:jc w:val="center"/>
+      </w:pPr>
+      <w:r>
+        <w:drawing>
+          <wp:inline xmlns:a="http://schemas.openxmlformats.org/drawingml/2006/main" xmlns:pic="http://schemas.openxmlformats.org/drawingml/2006/picture">
+            <wp:extent cx="5303520" cy="2196407"/>
+            <wp:docPr id="3" name="Picture 3"/>
+            <wp:cNvGraphicFramePr>
+              <a:graphicFrameLocks noChangeAspect="1"/>
+            </wp:cNvGraphicFramePr>
+            <a:graphic>
+              <a:graphicData uri="http://schemas.openxmlformats.org/drawingml/2006/picture">
+                <pic:pic>
+                  <pic:nvPicPr>
+                    <pic:cNvPr id="0" name="03-rag-flow.png"/>
+                    <pic:cNvPicPr/>
+                  </pic:nvPicPr>
+                  <pic:blipFill>
+                    <a:blip r:embed="rId11"/>
+                    <a:stretch>
+                      <a:fillRect/>
+                    </a:stretch>
+                  </pic:blipFill>
+                  <pic:spPr>
+                    <a:xfrm>
+                      <a:off x="0" y="0"/>
+                      <a:ext cx="5303520" cy="2196407"/>
+                    </a:xfrm>
+                    <a:prstGeom prst="rect"/>
+                  </pic:spPr>
+                </pic:pic>
+              </a:graphicData>
+            </a:graphic>
+          </wp:inline>
+        </w:drawing>
+      </w:r>
+    </w:p>
+    <w:p>
+      <w:pPr>
+        <w:spacing w:after="200"/>
+        <w:jc w:val="center"/>
+      </w:pPr>
+      <w:r>
+        <w:rPr>
+          <w:rFonts w:ascii="楷体" w:hAnsi="楷体" w:eastAsia="楷体"/>
+          <w:b w:val="0"/>
+          <w:sz w:val="20"/>
+        </w:rPr>
+        <w:t>图1-3 课程级 RAG 问答流程</w:t>
+      </w:r>
+    </w:p>
+    <w:p>
+      <w:pPr>
+        <w:spacing w:before="160"/>
+        <w:jc w:val="center"/>
+      </w:pPr>
+      <w:r>
+        <w:drawing>
+          <wp:inline xmlns:a="http://schemas.openxmlformats.org/drawingml/2006/main" xmlns:pic="http://schemas.openxmlformats.org/drawingml/2006/picture">
+            <wp:extent cx="4937760" cy="8321142"/>
+            <wp:docPr id="4" name="Picture 4"/>
+            <wp:cNvGraphicFramePr>
+              <a:graphicFrameLocks noChangeAspect="1"/>
+            </wp:cNvGraphicFramePr>
+            <a:graphic>
+              <a:graphicData uri="http://schemas.openxmlformats.org/drawingml/2006/picture">
+                <pic:pic>
+                  <pic:nvPicPr>
+                    <pic:cNvPr id="0" name="04-formulas.png"/>
+                    <pic:cNvPicPr/>
+                  </pic:nvPicPr>
+                  <pic:blipFill>
+                    <a:blip r:embed="rId12"/>
+                    <a:stretch>
+                      <a:fillRect/>
+                    </a:stretch>
+                  </pic:blipFill>
+                  <pic:spPr>
+                    <a:xfrm>
+                      <a:off x="0" y="0"/>
+                      <a:ext cx="4937760" cy="8321142"/>
+                    </a:xfrm>
+                    <a:prstGeom prst="rect"/>
+                  </pic:spPr>
+                </pic:pic>
+              </a:graphicData>
+            </a:graphic>
+          </wp:inline>
+        </w:drawing>
+      </w:r>
+    </w:p>
+    <w:p>
+      <w:pPr>
+        <w:spacing w:after="200"/>
+        <w:jc w:val="center"/>
+      </w:pPr>
+      <w:r>
+        <w:rPr>
+          <w:rFonts w:ascii="楷体" w:hAnsi="楷体" w:eastAsia="楷体"/>
+          <w:b w:val="0"/>
+          <w:sz w:val="20"/>
+        </w:rPr>
+        <w:t>图1-4 关键公式一览（排版图）</w:t>
       </w:r>
     </w:p>
     <w:p>
@@ -462,7 +1119,7 @@
           <w:b w:val="0"/>
           <w:sz w:val="24"/>
         </w:rPr>
-        <w:t>智学多模态 Agent 的「模型与算法」主线是多媒体感知（ASR/OCR）+ 时间对齐 + 课程级 RAG，以清晰的数据契约贯通存储、Worker 与前后端。当前版本已具备可演示、可测试的算法骨架与占位智能链路；正式向量检索与生产级语音识别属于明确规划中的增强项，应在结项材料中按「已实现 / 演进中」分层陈述。</w:t>
+        <w:t>智学多模态 Agent 的算法主线是多媒体感知（ASR/OCR）+ 时间对齐 + 课程级 RAG。上文式(1)–(13)给出形式化记号，便于与实现模块对照；正式向量检索与生产级语音识别为规划增强项，结项材料中应按「已实现 / 演进中」分层陈述。</w:t>
       </w:r>
     </w:p>
     <w:sectPr>

</xml_diff>